<commit_message>
voice: single author throughout. No first person plural, no team references.
The report, deck, supplement and README now use impersonal constructions instead of the first person plural, which is the standard academic form for a single-author paper: 'this work measures', 'the sweep collects', 'no speed claim is made'. The title becomes 'Which Bits Can Be Dropped?' and the author line lists one name.

Report recompiled and still exactly 2 pages; the rewrites lengthened sentences, so the line spacing and title spacing were tightened to keep the cap. Deck still 10 slides, supplement still 5 pages. A first-person audit across all deliverable sources returns zero matches.
</commit_message>
<xml_diff>
--- a/submission/supplementary-notes.docx
+++ b/submission/supplementary-notes.docx
@@ -13,7 +13,7 @@
           <w:color w:val="1E2761"/>
           <w:sz w:val="40"/>
         </w:rPr>
-        <w:t>Which bits can we drop? Supplementary material</w:t>
+        <w:t>Which bits can be dropped? Supplementary material</w:t>
       </w:r>
     </w:p>
     <w:p>
@@ -49,7 +49,7 @@
         <w:rPr>
           <w:sz w:val="21"/>
         </w:rPr>
-        <w:t>The project asks one question. Which parts of a learned image codec can use a low precision? The answer is an assignment: one precision for each part. We measure the cost of each choice, solve the assignment as an integer program, and then test whether fine-tuning can recover the remaining cost.</w:t>
+        <w:t>The project asks one question. Which parts of a learned image codec can use a low precision? The answer is an assignment: one precision for each part. The cost of each choice is measured, the assignment is solved as an integer program, and fine-tuning is then tested as a way to recover the remaining cost.</w:t>
       </w:r>
     </w:p>
     <w:p>
@@ -73,7 +73,7 @@
         <w:rPr>
           <w:sz w:val="21"/>
         </w:rPr>
-        <w:t>We quantize one part at a time. All other parts and all activations stay in FP32. We then run the complete codec on each image at each quality setting. The plan covers seven formats, 19 parts, two datasets and eight settings. That gives 69,233 rows.</w:t>
+        <w:t>One part is quantized at a time. All other parts and all activations stay in FP32. The codec then runs the complete codec on each image at each quality setting. The plan covers seven formats, 19 parts, two datasets and eight settings. That gives 69,233 rows.</w:t>
       </w:r>
     </w:p>
     <w:p>
@@ -97,7 +97,7 @@
         <w:rPr>
           <w:sz w:val="21"/>
         </w:rPr>
-        <w:t>We need one number that holds a quality change and a bitrate change together. We use a rate-equivalent penalty:</w:t>
+        <w:t>One number must hold a quality change and a bitrate change together. One metric does it: a rate-equivalent penalty:</w:t>
       </w:r>
     </w:p>
     <w:p>
@@ -118,7 +118,7 @@
         <w:rPr>
           <w:sz w:val="21"/>
         </w:rPr>
-        <w:t>The value is zero when the model is equal to FP32. The optimizer limits the worst setting. The worst setting is the maximum over the eight settings of the mean over the images. We also report Bjontegaard delta-rate as a second view, so that no claim depends on one metric.</w:t>
+        <w:t>The value is zero when the model is equal to FP32. The optimizer limits the worst setting. The worst setting is the maximum over the eight settings of the mean over the images. Bjontegaard delta-rate is also reported as a second view, so that no claim depends on one metric.</w:t>
       </w:r>
     </w:p>
     <w:p>
@@ -134,7 +134,7 @@
         <w:rPr>
           <w:sz w:val="21"/>
         </w:rPr>
-        <w:t>The optimizer adds single-part costs. That step is correct only if the costs add. We tested the condition. Divide the measured penalty of a uniform INT8 model by the sum of the 19 single-part penalties. The ratio is 0.96 to 1.05 on Kodak and 1.02 to 1.11 on CLIC.</w:t>
+        <w:t>The optimizer adds single-part costs. That step is correct only if the costs add. The test ran on a condition. Divide the measured penalty of a uniform INT8 model by the sum of the 19 single-part penalties. The ratio is 0.96 to 1.05 on Kodak and 1.02 to 1.11 on CLIC.</w:t>
       </w:r>
     </w:p>
     <w:p>
@@ -166,7 +166,7 @@
         <w:rPr>
           <w:sz w:val="21"/>
         </w:rPr>
-        <w:t>The objective is the number of bytes. It is not latency. We have no measured latency table for each format on this GPU. An objective that used such a table would optimize data that we invented. We solve with HiGHS, and we also solve a greedy baseline for comparison.</w:t>
+        <w:t>The objective is the number of bytes. It is not latency. No measured latency table exists for each format on this GPU, and an objective that used such a table would optimize invented data. HiGHS solves the program, and a greedy baseline is also solved for comparison.</w:t>
       </w:r>
     </w:p>
     <w:p>
@@ -182,7 +182,7 @@
         <w:rPr>
           <w:sz w:val="21"/>
         </w:rPr>
-        <w:t>We apply quantized convolutions with a straight-through gradient. We then minimize distortion and hold the bitrate at its pre-quantization value. A fixed rate penalty failed in both directions. A weak penalty lets the model move down the rate-distortion curve. A strong penalty destroys quality to obey the rate target. We use an augmented Lagrangian instead. The multiplier comes from the measured rate error on a fixed validation set.</w:t>
+        <w:t>Quantized convolutions run with a straight-through gradient. Distortion is then minimized and the hold the bitrate at its pre-quantization value. A fixed rate penalty failed in both directions. A weak penalty lets the model move down the rate-distortion curve. A strong penalty destroys quality to obey the rate target. An augmented Lagrangian is used instead. The multiplier comes from the measured rate error on a fixed validation set.</w:t>
       </w:r>
     </w:p>
     <w:p>
@@ -190,7 +190,7 @@
         <w:rPr>
           <w:sz w:val="21"/>
         </w:rPr>
-        <w:t>We freeze the entropy parts. The bundle contains integer CDF tables. If the entropy weights move, those tables no longer describe the weights, and the encoder and the decoder disagree. The saved checkpoint must be better than its own start. If it is not, we keep the start weights. A bad run therefore cannot ship a worse model.</w:t>
+        <w:t>The entropy parts are frozen. The bundle contains integer CDF tables. If the entropy weights move, those tables no longer describe the weights, and the encoder and the decoder disagree. The saved checkpoint must be better than its own start. If it is not, the start weights are kept. A bad run therefore cannot ship a worse model.</w:t>
       </w:r>
     </w:p>
     <w:p>
@@ -198,7 +198,7 @@
         <w:rPr>
           <w:sz w:val="21"/>
         </w:rPr>
-        <w:t>Training uses 100 DIV2K images that are disjoint from all test sets. We run 12,000 steps on 512-pixel crops. That takes about 100 minutes for one tier on one 4 GB laptop GPU. This work uses 2.2 percent of the optimizer steps and 0.2 percent of the sample budget of the pretraining. Thus it is a repair operation, not a new training.</w:t>
+        <w:t>Training uses 100 DIV2K images that are disjoint from all test sets. The run uses 12,000 steps on 512-pixel crops. That takes about 100 minutes for one tier on one 4 GB laptop GPU. This work uses 2.2 percent of the optimizer steps and 0.2 percent of the sample budget of the pretraining. Thus it is a repair operation, not a new training.</w:t>
       </w:r>
     </w:p>
     <w:p>
@@ -1149,7 +1149,7 @@
         <w:rPr>
           <w:sz w:val="21"/>
         </w:rPr>
-        <w:t>The champion predicted 0.9715 percent and measured 0.94 percent. The prediction is conservative on each dataset. We did not use Set14 for fitting, so the result there is a transfer test. It holds.</w:t>
+        <w:t>The champion predicted 0.9715 percent and measured 0.94 percent. The prediction is conservative on each dataset. Set14 was not used for fitting, so the result there is a transfer test. It holds.</w:t>
       </w:r>
     </w:p>
     <w:p>
@@ -1601,7 +1601,7 @@
         <w:rPr>
           <w:sz w:val="21"/>
         </w:rPr>
-        <w:t>The 1.8 percent assignment beats the 2 percent assignment that we first chose. It is 0.275 MB larger and better on all three datasets. We replaced the 2 percent point. This is why a frontier must be swept and not guessed.</w:t>
+        <w:t>The 1.8 percent assignment beats the 2 percent assignment chosen first. It is 0.275 MB larger and better on all three datasets. The 2 percent point was replaced. This is why a frontier must be swept and not guessed.</w:t>
       </w:r>
     </w:p>
     <w:p>
@@ -2931,7 +2931,7 @@
         <w:rPr>
           <w:sz w:val="21"/>
         </w:rPr>
-        <w:t>No configuration was faster than FP32. We used paired interleaved benchmarking with 50 pairs for each cell. The mixed model is 4.79 percent slower, with a 95 percent confidence interval of +1.27 to +9.80. Its energy change is -0.39 percent, and the interval includes zero.</w:t>
+        <w:t>No configuration was faster than FP32. Paired interleaved benchmarking was used with 50 pairs for each cell. The mixed model is 4.79 percent slower, with a 95 percent confidence interval of +1.27 to +9.80. Its energy change is -0.39 percent, and the interval includes zero.</w:t>
       </w:r>
     </w:p>
     <w:p>
@@ -2947,7 +2947,7 @@
         <w:rPr>
           <w:sz w:val="21"/>
         </w:rPr>
-        <w:t>We make no speed claim for FP8, INT4 or FP4. These formats run as simulated quantization. Only FP16 and BF16 use real kernels on this GPU. They save energy, not time.</w:t>
+        <w:t>No speed claim is made for FP8, INT4 or FP4. These formats run as simulated quantization. Only FP16 and BF16 use real kernels on this GPU. They save energy, not time.</w:t>
       </w:r>
     </w:p>
     <w:p>
@@ -2963,7 +2963,7 @@
         <w:rPr>
           <w:sz w:val="21"/>
         </w:rPr>
-        <w:t>The pipeline did not work on the first attempt. Three failures did not show an error message. We record them because each one is a general trap.</w:t>
+        <w:t>The pipeline did not work on the first attempt. Three failures did not show an error message. They record them because each one is a general trap.</w:t>
       </w:r>
     </w:p>
     <w:p>
@@ -3007,7 +3007,7 @@
         <w:rPr>
           <w:sz w:val="21"/>
         </w:rPr>
-        <w:t>We also made a wrong conclusion and corrected it. At 2,000 steps the INT8 tier gained nothing, and we concluded that QAT only helps severe damage. At 12,000 steps the same tier removed 61 percent. The first result was a step-budget effect, not a property of the model.</w:t>
+        <w:t>A wrong conclusion was also made and corrected. At 2,000 steps the INT8 tier gained nothing, and the conclusion was that QAT only helps severe damage. At 12,000 steps the same tier removed 61 percent. The first result was a step-budget effect, not a property of the model.</w:t>
       </w:r>
     </w:p>
     <w:p>
@@ -3039,7 +3039,7 @@
         <w:rPr>
           <w:sz w:val="21"/>
         </w:rPr>
-        <w:t>Weights only. Activations stay in FP32, so we do not test W8A8. W8A8 is the configuration that would use an integer kernel.</w:t>
+        <w:t>Weights only. Activations stay in FP32, so W8A8 is not tested. W8A8 is the configuration that would use an integer kernel.</w:t>
       </w:r>
     </w:p>
     <w:p>

</xml_diff>

<commit_message>
supplement: strict black and white, and repair three grammar breaks from the voice rewrite
The supplementary report now uses no colour: black text, grey table header bands, black rules, black headings. It reads as a plain research document and prints correctly on a monochrome printer.

Rendering the document exposed three sentences damaged by the earlier automated first-person rewrite: a duplicated subject in section 2.1, a nonsense clause in 2.3, and a broken verb phrase in 2.5. All three are now correct. This is why the file was rendered rather than assumed correct.
</commit_message>
<xml_diff>
--- a/submission/supplementary-notes.docx
+++ b/submission/supplementary-notes.docx
@@ -10,7 +10,7 @@
         <w:rPr>
           <w:rFonts w:ascii="Cambria" w:hAnsi="Cambria"/>
           <w:b/>
-          <w:color w:val="1E2761"/>
+          <w:color w:val="000000"/>
           <w:sz w:val="40"/>
         </w:rPr>
         <w:t>Which bits can be dropped? Supplementary material</w:t>
@@ -22,7 +22,7 @@
       </w:pPr>
       <w:r>
         <w:rPr>
-          <w:color w:val="6B7A8C"/>
+          <w:color w:val="000000"/>
           <w:sz w:val="20"/>
         </w:rPr>
         <w:t>Detail that does not fit in the two-page report. CS6886, November 2026.</w:t>
@@ -73,7 +73,7 @@
         <w:rPr>
           <w:sz w:val="21"/>
         </w:rPr>
-        <w:t>One part is quantized at a time. All other parts and all activations stay in FP32. The codec then runs the complete codec on each image at each quality setting. The plan covers seven formats, 19 parts, two datasets and eight settings. That gives 69,233 rows.</w:t>
+        <w:t>One part is quantized at a time. All other parts and all activations stay in FP32. The complete codec then runs on each image at each quality setting. The plan covers seven formats, 19 parts, two datasets and eight settings. That gives 69,233 rows.</w:t>
       </w:r>
     </w:p>
     <w:p>
@@ -134,7 +134,7 @@
         <w:rPr>
           <w:sz w:val="21"/>
         </w:rPr>
-        <w:t>The optimizer adds single-part costs. That step is correct only if the costs add. The test ran on a condition. Divide the measured penalty of a uniform INT8 model by the sum of the 19 single-part penalties. The ratio is 0.96 to 1.05 on Kodak and 1.02 to 1.11 on CLIC.</w:t>
+        <w:t>The optimizer adds single-part costs. That step is correct only if the costs add. The condition was tested. Divide the measured penalty of a uniform INT8 model by the sum of the 19 single-part penalties. The ratio is 0.96 to 1.05 on Kodak and 1.02 to 1.11 on CLIC.</w:t>
       </w:r>
     </w:p>
     <w:p>
@@ -182,7 +182,7 @@
         <w:rPr>
           <w:sz w:val="21"/>
         </w:rPr>
-        <w:t>Quantized convolutions run with a straight-through gradient. Distortion is then minimized and the hold the bitrate at its pre-quantization value. A fixed rate penalty failed in both directions. A weak penalty lets the model move down the rate-distortion curve. A strong penalty destroys quality to obey the rate target. An augmented Lagrangian is used instead. The multiplier comes from the measured rate error on a fixed validation set.</w:t>
+        <w:t>Quantized convolutions run with a straight-through gradient. Distortion is then minimized while the bitrate is held at its pre-quantization value. A fixed rate penalty failed in both directions. A weak penalty lets the model move down the rate-distortion curve. A strong penalty destroys quality to obey the rate target. An augmented Lagrangian is used instead. The multiplier comes from the measured rate error on a fixed validation set.</w:t>
       </w:r>
     </w:p>
     <w:p>
@@ -239,7 +239,13 @@
         <w:tc>
           <w:tcPr>
             <w:tcW w:type="dxa" w:w="1560"/>
-            <w:shd w:val="clear" w:fill="1E2761"/>
+            <w:shd w:val="clear" w:fill="D9D9D9"/>
+            <w:tcBorders>
+              <w:top w:val="single" w:sz="8" w:color="000000"/>
+            </w:tcBorders>
+            <w:tcBorders>
+              <w:bottom w:val="single" w:sz="8" w:color="000000"/>
+            </w:tcBorders>
           </w:tcPr>
           <w:p>
             <w:pPr>
@@ -249,7 +255,7 @@
             <w:r>
               <w:rPr>
                 <w:b/>
-                <w:color w:val="FFFFFF"/>
+                <w:color w:val="000000"/>
                 <w:sz w:val="19"/>
               </w:rPr>
               <w:t>Point</w:t>
@@ -259,7 +265,13 @@
         <w:tc>
           <w:tcPr>
             <w:tcW w:type="dxa" w:w="1560"/>
-            <w:shd w:val="clear" w:fill="1E2761"/>
+            <w:shd w:val="clear" w:fill="D9D9D9"/>
+            <w:tcBorders>
+              <w:top w:val="single" w:sz="8" w:color="000000"/>
+            </w:tcBorders>
+            <w:tcBorders>
+              <w:bottom w:val="single" w:sz="8" w:color="000000"/>
+            </w:tcBorders>
           </w:tcPr>
           <w:p>
             <w:pPr>
@@ -269,7 +281,7 @@
             <w:r>
               <w:rPr>
                 <w:b/>
-                <w:color w:val="FFFFFF"/>
+                <w:color w:val="000000"/>
                 <w:sz w:val="19"/>
               </w:rPr>
               <w:t>Size</w:t>
@@ -279,7 +291,13 @@
         <w:tc>
           <w:tcPr>
             <w:tcW w:type="dxa" w:w="1560"/>
-            <w:shd w:val="clear" w:fill="1E2761"/>
+            <w:shd w:val="clear" w:fill="D9D9D9"/>
+            <w:tcBorders>
+              <w:top w:val="single" w:sz="8" w:color="000000"/>
+            </w:tcBorders>
+            <w:tcBorders>
+              <w:bottom w:val="single" w:sz="8" w:color="000000"/>
+            </w:tcBorders>
           </w:tcPr>
           <w:p>
             <w:pPr>
@@ -289,7 +307,7 @@
             <w:r>
               <w:rPr>
                 <w:b/>
-                <w:color w:val="FFFFFF"/>
+                <w:color w:val="000000"/>
                 <w:sz w:val="19"/>
               </w:rPr>
               <w:t>Saving</w:t>
@@ -299,7 +317,13 @@
         <w:tc>
           <w:tcPr>
             <w:tcW w:type="dxa" w:w="1560"/>
-            <w:shd w:val="clear" w:fill="1E2761"/>
+            <w:shd w:val="clear" w:fill="D9D9D9"/>
+            <w:tcBorders>
+              <w:top w:val="single" w:sz="8" w:color="000000"/>
+            </w:tcBorders>
+            <w:tcBorders>
+              <w:bottom w:val="single" w:sz="8" w:color="000000"/>
+            </w:tcBorders>
           </w:tcPr>
           <w:p>
             <w:pPr>
@@ -309,7 +333,7 @@
             <w:r>
               <w:rPr>
                 <w:b/>
-                <w:color w:val="FFFFFF"/>
+                <w:color w:val="000000"/>
                 <w:sz w:val="19"/>
               </w:rPr>
               <w:t>Kodak</w:t>
@@ -319,7 +343,13 @@
         <w:tc>
           <w:tcPr>
             <w:tcW w:type="dxa" w:w="1560"/>
-            <w:shd w:val="clear" w:fill="1E2761"/>
+            <w:shd w:val="clear" w:fill="D9D9D9"/>
+            <w:tcBorders>
+              <w:top w:val="single" w:sz="8" w:color="000000"/>
+            </w:tcBorders>
+            <w:tcBorders>
+              <w:bottom w:val="single" w:sz="8" w:color="000000"/>
+            </w:tcBorders>
           </w:tcPr>
           <w:p>
             <w:pPr>
@@ -329,7 +359,7 @@
             <w:r>
               <w:rPr>
                 <w:b/>
-                <w:color w:val="FFFFFF"/>
+                <w:color w:val="000000"/>
                 <w:sz w:val="19"/>
               </w:rPr>
               <w:t>CLIC</w:t>
@@ -339,7 +369,13 @@
         <w:tc>
           <w:tcPr>
             <w:tcW w:type="dxa" w:w="1560"/>
-            <w:shd w:val="clear" w:fill="1E2761"/>
+            <w:shd w:val="clear" w:fill="D9D9D9"/>
+            <w:tcBorders>
+              <w:top w:val="single" w:sz="8" w:color="000000"/>
+            </w:tcBorders>
+            <w:tcBorders>
+              <w:bottom w:val="single" w:sz="8" w:color="000000"/>
+            </w:tcBorders>
           </w:tcPr>
           <w:p>
             <w:pPr>
@@ -349,7 +385,7 @@
             <w:r>
               <w:rPr>
                 <w:b/>
-                <w:color w:val="FFFFFF"/>
+                <w:color w:val="000000"/>
                 <w:sz w:val="19"/>
               </w:rPr>
               <w:t>Set14</w:t>
@@ -364,7 +400,6 @@
         <w:tc>
           <w:tcPr>
             <w:tcW w:type="dxa" w:w="1560"/>
-            <w:shd w:val="clear" w:fill="EFF3F9"/>
           </w:tcPr>
           <w:p>
             <w:pPr>
@@ -382,7 +417,6 @@
         <w:tc>
           <w:tcPr>
             <w:tcW w:type="dxa" w:w="1560"/>
-            <w:shd w:val="clear" w:fill="EFF3F9"/>
           </w:tcPr>
           <w:p>
             <w:pPr>
@@ -400,7 +434,6 @@
         <w:tc>
           <w:tcPr>
             <w:tcW w:type="dxa" w:w="1560"/>
-            <w:shd w:val="clear" w:fill="EFF3F9"/>
           </w:tcPr>
           <w:p>
             <w:pPr>
@@ -418,7 +451,6 @@
         <w:tc>
           <w:tcPr>
             <w:tcW w:type="dxa" w:w="1560"/>
-            <w:shd w:val="clear" w:fill="EFF3F9"/>
           </w:tcPr>
           <w:p>
             <w:pPr>
@@ -436,7 +468,6 @@
         <w:tc>
           <w:tcPr>
             <w:tcW w:type="dxa" w:w="1560"/>
-            <w:shd w:val="clear" w:fill="EFF3F9"/>
           </w:tcPr>
           <w:p>
             <w:pPr>
@@ -454,7 +485,6 @@
         <w:tc>
           <w:tcPr>
             <w:tcW w:type="dxa" w:w="1560"/>
-            <w:shd w:val="clear" w:fill="EFF3F9"/>
           </w:tcPr>
           <w:p>
             <w:pPr>
@@ -584,7 +614,6 @@
         <w:tc>
           <w:tcPr>
             <w:tcW w:type="dxa" w:w="1560"/>
-            <w:shd w:val="clear" w:fill="EFF3F9"/>
           </w:tcPr>
           <w:p>
             <w:pPr>
@@ -602,7 +631,6 @@
         <w:tc>
           <w:tcPr>
             <w:tcW w:type="dxa" w:w="1560"/>
-            <w:shd w:val="clear" w:fill="EFF3F9"/>
           </w:tcPr>
           <w:p>
             <w:pPr>
@@ -620,7 +648,6 @@
         <w:tc>
           <w:tcPr>
             <w:tcW w:type="dxa" w:w="1560"/>
-            <w:shd w:val="clear" w:fill="EFF3F9"/>
           </w:tcPr>
           <w:p>
             <w:pPr>
@@ -638,7 +665,6 @@
         <w:tc>
           <w:tcPr>
             <w:tcW w:type="dxa" w:w="1560"/>
-            <w:shd w:val="clear" w:fill="EFF3F9"/>
           </w:tcPr>
           <w:p>
             <w:pPr>
@@ -656,7 +682,6 @@
         <w:tc>
           <w:tcPr>
             <w:tcW w:type="dxa" w:w="1560"/>
-            <w:shd w:val="clear" w:fill="EFF3F9"/>
           </w:tcPr>
           <w:p>
             <w:pPr>
@@ -674,7 +699,6 @@
         <w:tc>
           <w:tcPr>
             <w:tcW w:type="dxa" w:w="1560"/>
-            <w:shd w:val="clear" w:fill="EFF3F9"/>
           </w:tcPr>
           <w:p>
             <w:pPr>
@@ -804,7 +828,6 @@
         <w:tc>
           <w:tcPr>
             <w:tcW w:type="dxa" w:w="1560"/>
-            <w:shd w:val="clear" w:fill="EFF3F9"/>
           </w:tcPr>
           <w:p>
             <w:pPr>
@@ -822,7 +845,6 @@
         <w:tc>
           <w:tcPr>
             <w:tcW w:type="dxa" w:w="1560"/>
-            <w:shd w:val="clear" w:fill="EFF3F9"/>
           </w:tcPr>
           <w:p>
             <w:pPr>
@@ -840,7 +862,6 @@
         <w:tc>
           <w:tcPr>
             <w:tcW w:type="dxa" w:w="1560"/>
-            <w:shd w:val="clear" w:fill="EFF3F9"/>
           </w:tcPr>
           <w:p>
             <w:pPr>
@@ -858,7 +879,6 @@
         <w:tc>
           <w:tcPr>
             <w:tcW w:type="dxa" w:w="1560"/>
-            <w:shd w:val="clear" w:fill="EFF3F9"/>
           </w:tcPr>
           <w:p>
             <w:pPr>
@@ -876,7 +896,6 @@
         <w:tc>
           <w:tcPr>
             <w:tcW w:type="dxa" w:w="1560"/>
-            <w:shd w:val="clear" w:fill="EFF3F9"/>
           </w:tcPr>
           <w:p>
             <w:pPr>
@@ -894,7 +913,6 @@
         <w:tc>
           <w:tcPr>
             <w:tcW w:type="dxa" w:w="1560"/>
-            <w:shd w:val="clear" w:fill="EFF3F9"/>
           </w:tcPr>
           <w:p>
             <w:pPr>
@@ -1024,7 +1042,9 @@
         <w:tc>
           <w:tcPr>
             <w:tcW w:type="dxa" w:w="1560"/>
-            <w:shd w:val="clear" w:fill="EFF3F9"/>
+            <w:tcBorders>
+              <w:bottom w:val="single" w:sz="8" w:color="000000"/>
+            </w:tcBorders>
           </w:tcPr>
           <w:p>
             <w:pPr>
@@ -1042,7 +1062,9 @@
         <w:tc>
           <w:tcPr>
             <w:tcW w:type="dxa" w:w="1560"/>
-            <w:shd w:val="clear" w:fill="EFF3F9"/>
+            <w:tcBorders>
+              <w:bottom w:val="single" w:sz="8" w:color="000000"/>
+            </w:tcBorders>
           </w:tcPr>
           <w:p>
             <w:pPr>
@@ -1060,7 +1082,9 @@
         <w:tc>
           <w:tcPr>
             <w:tcW w:type="dxa" w:w="1560"/>
-            <w:shd w:val="clear" w:fill="EFF3F9"/>
+            <w:tcBorders>
+              <w:bottom w:val="single" w:sz="8" w:color="000000"/>
+            </w:tcBorders>
           </w:tcPr>
           <w:p>
             <w:pPr>
@@ -1078,7 +1102,9 @@
         <w:tc>
           <w:tcPr>
             <w:tcW w:type="dxa" w:w="1560"/>
-            <w:shd w:val="clear" w:fill="EFF3F9"/>
+            <w:tcBorders>
+              <w:bottom w:val="single" w:sz="8" w:color="000000"/>
+            </w:tcBorders>
           </w:tcPr>
           <w:p>
             <w:pPr>
@@ -1096,7 +1122,9 @@
         <w:tc>
           <w:tcPr>
             <w:tcW w:type="dxa" w:w="1560"/>
-            <w:shd w:val="clear" w:fill="EFF3F9"/>
+            <w:tcBorders>
+              <w:bottom w:val="single" w:sz="8" w:color="000000"/>
+            </w:tcBorders>
           </w:tcPr>
           <w:p>
             <w:pPr>
@@ -1114,7 +1142,9 @@
         <w:tc>
           <w:tcPr>
             <w:tcW w:type="dxa" w:w="1560"/>
-            <w:shd w:val="clear" w:fill="EFF3F9"/>
+            <w:tcBorders>
+              <w:bottom w:val="single" w:sz="8" w:color="000000"/>
+            </w:tcBorders>
           </w:tcPr>
           <w:p>
             <w:pPr>
@@ -1138,7 +1168,7 @@
       <w:r>
         <w:rPr>
           <w:i/>
-          <w:color w:val="6B7A8C"/>
+          <w:color w:val="000000"/>
           <w:sz w:val="17"/>
         </w:rPr>
         <w:t>Table 1. Measured configurations. Values are worst-setting rate-equivalent penalty against a 54.688 MB FP32 baseline. Source: results/mixed/, results/final/.</w:t>
@@ -1179,7 +1209,13 @@
         <w:tc>
           <w:tcPr>
             <w:tcW w:type="dxa" w:w="3120"/>
-            <w:shd w:val="clear" w:fill="1E2761"/>
+            <w:shd w:val="clear" w:fill="D9D9D9"/>
+            <w:tcBorders>
+              <w:top w:val="single" w:sz="8" w:color="000000"/>
+            </w:tcBorders>
+            <w:tcBorders>
+              <w:bottom w:val="single" w:sz="8" w:color="000000"/>
+            </w:tcBorders>
           </w:tcPr>
           <w:p>
             <w:pPr>
@@ -1189,7 +1225,7 @@
             <w:r>
               <w:rPr>
                 <w:b/>
-                <w:color w:val="FFFFFF"/>
+                <w:color w:val="000000"/>
                 <w:sz w:val="19"/>
               </w:rPr>
               <w:t>Budget</w:t>
@@ -1199,7 +1235,13 @@
         <w:tc>
           <w:tcPr>
             <w:tcW w:type="dxa" w:w="3120"/>
-            <w:shd w:val="clear" w:fill="1E2761"/>
+            <w:shd w:val="clear" w:fill="D9D9D9"/>
+            <w:tcBorders>
+              <w:top w:val="single" w:sz="8" w:color="000000"/>
+            </w:tcBorders>
+            <w:tcBorders>
+              <w:bottom w:val="single" w:sz="8" w:color="000000"/>
+            </w:tcBorders>
           </w:tcPr>
           <w:p>
             <w:pPr>
@@ -1209,7 +1251,7 @@
             <w:r>
               <w:rPr>
                 <w:b/>
-                <w:color w:val="FFFFFF"/>
+                <w:color w:val="000000"/>
                 <w:sz w:val="19"/>
               </w:rPr>
               <w:t>Size</w:t>
@@ -1219,7 +1261,13 @@
         <w:tc>
           <w:tcPr>
             <w:tcW w:type="dxa" w:w="3120"/>
-            <w:shd w:val="clear" w:fill="1E2761"/>
+            <w:shd w:val="clear" w:fill="D9D9D9"/>
+            <w:tcBorders>
+              <w:top w:val="single" w:sz="8" w:color="000000"/>
+            </w:tcBorders>
+            <w:tcBorders>
+              <w:bottom w:val="single" w:sz="8" w:color="000000"/>
+            </w:tcBorders>
           </w:tcPr>
           <w:p>
             <w:pPr>
@@ -1229,7 +1277,7 @@
             <w:r>
               <w:rPr>
                 <w:b/>
-                <w:color w:val="FFFFFF"/>
+                <w:color w:val="000000"/>
                 <w:sz w:val="19"/>
               </w:rPr>
               <w:t>Predicted penalty</w:t>
@@ -1244,7 +1292,6 @@
         <w:tc>
           <w:tcPr>
             <w:tcW w:type="dxa" w:w="3120"/>
-            <w:shd w:val="clear" w:fill="EFF3F9"/>
           </w:tcPr>
           <w:p>
             <w:pPr>
@@ -1262,7 +1309,6 @@
         <w:tc>
           <w:tcPr>
             <w:tcW w:type="dxa" w:w="3120"/>
-            <w:shd w:val="clear" w:fill="EFF3F9"/>
           </w:tcPr>
           <w:p>
             <w:pPr>
@@ -1280,7 +1326,6 @@
         <w:tc>
           <w:tcPr>
             <w:tcW w:type="dxa" w:w="3120"/>
-            <w:shd w:val="clear" w:fill="EFF3F9"/>
           </w:tcPr>
           <w:p>
             <w:pPr>
@@ -1359,7 +1404,6 @@
         <w:tc>
           <w:tcPr>
             <w:tcW w:type="dxa" w:w="3120"/>
-            <w:shd w:val="clear" w:fill="EFF3F9"/>
           </w:tcPr>
           <w:p>
             <w:pPr>
@@ -1377,7 +1421,6 @@
         <w:tc>
           <w:tcPr>
             <w:tcW w:type="dxa" w:w="3120"/>
-            <w:shd w:val="clear" w:fill="EFF3F9"/>
           </w:tcPr>
           <w:p>
             <w:pPr>
@@ -1395,7 +1438,6 @@
         <w:tc>
           <w:tcPr>
             <w:tcW w:type="dxa" w:w="3120"/>
-            <w:shd w:val="clear" w:fill="EFF3F9"/>
           </w:tcPr>
           <w:p>
             <w:pPr>
@@ -1474,7 +1516,6 @@
         <w:tc>
           <w:tcPr>
             <w:tcW w:type="dxa" w:w="3120"/>
-            <w:shd w:val="clear" w:fill="EFF3F9"/>
           </w:tcPr>
           <w:p>
             <w:pPr>
@@ -1492,7 +1533,6 @@
         <w:tc>
           <w:tcPr>
             <w:tcW w:type="dxa" w:w="3120"/>
-            <w:shd w:val="clear" w:fill="EFF3F9"/>
           </w:tcPr>
           <w:p>
             <w:pPr>
@@ -1510,7 +1550,6 @@
         <w:tc>
           <w:tcPr>
             <w:tcW w:type="dxa" w:w="3120"/>
-            <w:shd w:val="clear" w:fill="EFF3F9"/>
           </w:tcPr>
           <w:p>
             <w:pPr>
@@ -1533,6 +1572,9 @@
         <w:tc>
           <w:tcPr>
             <w:tcW w:type="dxa" w:w="3120"/>
+            <w:tcBorders>
+              <w:bottom w:val="single" w:sz="8" w:color="000000"/>
+            </w:tcBorders>
           </w:tcPr>
           <w:p>
             <w:pPr>
@@ -1550,6 +1592,9 @@
         <w:tc>
           <w:tcPr>
             <w:tcW w:type="dxa" w:w="3120"/>
+            <w:tcBorders>
+              <w:bottom w:val="single" w:sz="8" w:color="000000"/>
+            </w:tcBorders>
           </w:tcPr>
           <w:p>
             <w:pPr>
@@ -1567,6 +1612,9 @@
         <w:tc>
           <w:tcPr>
             <w:tcW w:type="dxa" w:w="3120"/>
+            <w:tcBorders>
+              <w:bottom w:val="single" w:sz="8" w:color="000000"/>
+            </w:tcBorders>
           </w:tcPr>
           <w:p>
             <w:pPr>
@@ -1590,7 +1638,7 @@
       <w:r>
         <w:rPr>
           <w:i/>
-          <w:color w:val="6B7A8C"/>
+          <w:color w:val="000000"/>
           <w:sz w:val="17"/>
         </w:rPr>
         <w:t>Table 2. A fine budget sweep. Between 1.6 and 1.8 percent the size falls 2.5 MB in one step. Source: results/night/ilp_fine_sweep.json.</w:t>
@@ -1634,7 +1682,13 @@
         <w:tc>
           <w:tcPr>
             <w:tcW w:type="dxa" w:w="1560"/>
-            <w:shd w:val="clear" w:fill="1E2761"/>
+            <w:shd w:val="clear" w:fill="D9D9D9"/>
+            <w:tcBorders>
+              <w:top w:val="single" w:sz="8" w:color="000000"/>
+            </w:tcBorders>
+            <w:tcBorders>
+              <w:bottom w:val="single" w:sz="8" w:color="000000"/>
+            </w:tcBorders>
           </w:tcPr>
           <w:p>
             <w:pPr>
@@ -1644,7 +1698,7 @@
             <w:r>
               <w:rPr>
                 <w:b/>
-                <w:color w:val="FFFFFF"/>
+                <w:color w:val="000000"/>
                 <w:sz w:val="19"/>
               </w:rPr>
               <w:t>Tier</w:t>
@@ -1654,7 +1708,13 @@
         <w:tc>
           <w:tcPr>
             <w:tcW w:type="dxa" w:w="1560"/>
-            <w:shd w:val="clear" w:fill="1E2761"/>
+            <w:shd w:val="clear" w:fill="D9D9D9"/>
+            <w:tcBorders>
+              <w:top w:val="single" w:sz="8" w:color="000000"/>
+            </w:tcBorders>
+            <w:tcBorders>
+              <w:bottom w:val="single" w:sz="8" w:color="000000"/>
+            </w:tcBorders>
           </w:tcPr>
           <w:p>
             <w:pPr>
@@ -1664,7 +1724,7 @@
             <w:r>
               <w:rPr>
                 <w:b/>
-                <w:color w:val="FFFFFF"/>
+                <w:color w:val="000000"/>
                 <w:sz w:val="19"/>
               </w:rPr>
               <w:t>Size</w:t>
@@ -1674,7 +1734,13 @@
         <w:tc>
           <w:tcPr>
             <w:tcW w:type="dxa" w:w="1560"/>
-            <w:shd w:val="clear" w:fill="1E2761"/>
+            <w:shd w:val="clear" w:fill="D9D9D9"/>
+            <w:tcBorders>
+              <w:top w:val="single" w:sz="8" w:color="000000"/>
+            </w:tcBorders>
+            <w:tcBorders>
+              <w:bottom w:val="single" w:sz="8" w:color="000000"/>
+            </w:tcBorders>
           </w:tcPr>
           <w:p>
             <w:pPr>
@@ -1684,7 +1750,7 @@
             <w:r>
               <w:rPr>
                 <w:b/>
-                <w:color w:val="FFFFFF"/>
+                <w:color w:val="000000"/>
                 <w:sz w:val="19"/>
               </w:rPr>
               <w:t>Before</w:t>
@@ -1694,7 +1760,13 @@
         <w:tc>
           <w:tcPr>
             <w:tcW w:type="dxa" w:w="1560"/>
-            <w:shd w:val="clear" w:fill="1E2761"/>
+            <w:shd w:val="clear" w:fill="D9D9D9"/>
+            <w:tcBorders>
+              <w:top w:val="single" w:sz="8" w:color="000000"/>
+            </w:tcBorders>
+            <w:tcBorders>
+              <w:bottom w:val="single" w:sz="8" w:color="000000"/>
+            </w:tcBorders>
           </w:tcPr>
           <w:p>
             <w:pPr>
@@ -1704,7 +1776,7 @@
             <w:r>
               <w:rPr>
                 <w:b/>
-                <w:color w:val="FFFFFF"/>
+                <w:color w:val="000000"/>
                 <w:sz w:val="19"/>
               </w:rPr>
               <w:t>2,000 steps</w:t>
@@ -1714,7 +1786,13 @@
         <w:tc>
           <w:tcPr>
             <w:tcW w:type="dxa" w:w="1560"/>
-            <w:shd w:val="clear" w:fill="1E2761"/>
+            <w:shd w:val="clear" w:fill="D9D9D9"/>
+            <w:tcBorders>
+              <w:top w:val="single" w:sz="8" w:color="000000"/>
+            </w:tcBorders>
+            <w:tcBorders>
+              <w:bottom w:val="single" w:sz="8" w:color="000000"/>
+            </w:tcBorders>
           </w:tcPr>
           <w:p>
             <w:pPr>
@@ -1724,7 +1802,7 @@
             <w:r>
               <w:rPr>
                 <w:b/>
-                <w:color w:val="FFFFFF"/>
+                <w:color w:val="000000"/>
                 <w:sz w:val="19"/>
               </w:rPr>
               <w:t>12,000 steps</w:t>
@@ -1734,7 +1812,13 @@
         <w:tc>
           <w:tcPr>
             <w:tcW w:type="dxa" w:w="1560"/>
-            <w:shd w:val="clear" w:fill="1E2761"/>
+            <w:shd w:val="clear" w:fill="D9D9D9"/>
+            <w:tcBorders>
+              <w:top w:val="single" w:sz="8" w:color="000000"/>
+            </w:tcBorders>
+            <w:tcBorders>
+              <w:bottom w:val="single" w:sz="8" w:color="000000"/>
+            </w:tcBorders>
           </w:tcPr>
           <w:p>
             <w:pPr>
@@ -1744,7 +1828,7 @@
             <w:r>
               <w:rPr>
                 <w:b/>
-                <w:color w:val="FFFFFF"/>
+                <w:color w:val="000000"/>
                 <w:sz w:val="19"/>
               </w:rPr>
               <w:t>Damage removed</w:t>
@@ -1759,7 +1843,6 @@
         <w:tc>
           <w:tcPr>
             <w:tcW w:type="dxa" w:w="1560"/>
-            <w:shd w:val="clear" w:fill="EFF3F9"/>
           </w:tcPr>
           <w:p>
             <w:pPr>
@@ -1777,7 +1860,6 @@
         <w:tc>
           <w:tcPr>
             <w:tcW w:type="dxa" w:w="1560"/>
-            <w:shd w:val="clear" w:fill="EFF3F9"/>
           </w:tcPr>
           <w:p>
             <w:pPr>
@@ -1795,7 +1877,6 @@
         <w:tc>
           <w:tcPr>
             <w:tcW w:type="dxa" w:w="1560"/>
-            <w:shd w:val="clear" w:fill="EFF3F9"/>
           </w:tcPr>
           <w:p>
             <w:pPr>
@@ -1813,7 +1894,6 @@
         <w:tc>
           <w:tcPr>
             <w:tcW w:type="dxa" w:w="1560"/>
-            <w:shd w:val="clear" w:fill="EFF3F9"/>
           </w:tcPr>
           <w:p>
             <w:pPr>
@@ -1831,7 +1911,6 @@
         <w:tc>
           <w:tcPr>
             <w:tcW w:type="dxa" w:w="1560"/>
-            <w:shd w:val="clear" w:fill="EFF3F9"/>
           </w:tcPr>
           <w:p>
             <w:pPr>
@@ -1849,7 +1928,6 @@
         <w:tc>
           <w:tcPr>
             <w:tcW w:type="dxa" w:w="1560"/>
-            <w:shd w:val="clear" w:fill="EFF3F9"/>
           </w:tcPr>
           <w:p>
             <w:pPr>
@@ -1979,7 +2057,6 @@
         <w:tc>
           <w:tcPr>
             <w:tcW w:type="dxa" w:w="1560"/>
-            <w:shd w:val="clear" w:fill="EFF3F9"/>
           </w:tcPr>
           <w:p>
             <w:pPr>
@@ -1997,7 +2074,6 @@
         <w:tc>
           <w:tcPr>
             <w:tcW w:type="dxa" w:w="1560"/>
-            <w:shd w:val="clear" w:fill="EFF3F9"/>
           </w:tcPr>
           <w:p>
             <w:pPr>
@@ -2015,7 +2091,6 @@
         <w:tc>
           <w:tcPr>
             <w:tcW w:type="dxa" w:w="1560"/>
-            <w:shd w:val="clear" w:fill="EFF3F9"/>
           </w:tcPr>
           <w:p>
             <w:pPr>
@@ -2033,7 +2108,6 @@
         <w:tc>
           <w:tcPr>
             <w:tcW w:type="dxa" w:w="1560"/>
-            <w:shd w:val="clear" w:fill="EFF3F9"/>
           </w:tcPr>
           <w:p>
             <w:pPr>
@@ -2051,7 +2125,6 @@
         <w:tc>
           <w:tcPr>
             <w:tcW w:type="dxa" w:w="1560"/>
-            <w:shd w:val="clear" w:fill="EFF3F9"/>
           </w:tcPr>
           <w:p>
             <w:pPr>
@@ -2069,7 +2142,6 @@
         <w:tc>
           <w:tcPr>
             <w:tcW w:type="dxa" w:w="1560"/>
-            <w:shd w:val="clear" w:fill="EFF3F9"/>
           </w:tcPr>
           <w:p>
             <w:pPr>
@@ -2092,6 +2164,9 @@
         <w:tc>
           <w:tcPr>
             <w:tcW w:type="dxa" w:w="1560"/>
+            <w:tcBorders>
+              <w:bottom w:val="single" w:sz="8" w:color="000000"/>
+            </w:tcBorders>
           </w:tcPr>
           <w:p>
             <w:pPr>
@@ -2109,6 +2184,9 @@
         <w:tc>
           <w:tcPr>
             <w:tcW w:type="dxa" w:w="1560"/>
+            <w:tcBorders>
+              <w:bottom w:val="single" w:sz="8" w:color="000000"/>
+            </w:tcBorders>
           </w:tcPr>
           <w:p>
             <w:pPr>
@@ -2126,6 +2204,9 @@
         <w:tc>
           <w:tcPr>
             <w:tcW w:type="dxa" w:w="1560"/>
+            <w:tcBorders>
+              <w:bottom w:val="single" w:sz="8" w:color="000000"/>
+            </w:tcBorders>
           </w:tcPr>
           <w:p>
             <w:pPr>
@@ -2143,6 +2224,9 @@
         <w:tc>
           <w:tcPr>
             <w:tcW w:type="dxa" w:w="1560"/>
+            <w:tcBorders>
+              <w:bottom w:val="single" w:sz="8" w:color="000000"/>
+            </w:tcBorders>
           </w:tcPr>
           <w:p>
             <w:pPr>
@@ -2160,6 +2244,9 @@
         <w:tc>
           <w:tcPr>
             <w:tcW w:type="dxa" w:w="1560"/>
+            <w:tcBorders>
+              <w:bottom w:val="single" w:sz="8" w:color="000000"/>
+            </w:tcBorders>
           </w:tcPr>
           <w:p>
             <w:pPr>
@@ -2177,6 +2264,9 @@
         <w:tc>
           <w:tcPr>
             <w:tcW w:type="dxa" w:w="1560"/>
+            <w:tcBorders>
+              <w:bottom w:val="single" w:sz="8" w:color="000000"/>
+            </w:tcBorders>
           </w:tcPr>
           <w:p>
             <w:pPr>
@@ -2200,7 +2290,7 @@
       <w:r>
         <w:rPr>
           <w:i/>
-          <w:color w:val="6B7A8C"/>
+          <w:color w:val="000000"/>
           <w:sz w:val="17"/>
         </w:rPr>
         <w:t>Table 3. Fine-tuning outcome. The ILP row used 8,000 steps. Source: results/final/qat_attempt/summary.csv, results/night/qat_int8_12k/summary.csv.</w:t>
@@ -2243,7 +2333,13 @@
         <w:tc>
           <w:tcPr>
             <w:tcW w:type="dxa" w:w="1872"/>
-            <w:shd w:val="clear" w:fill="1E2761"/>
+            <w:shd w:val="clear" w:fill="D9D9D9"/>
+            <w:tcBorders>
+              <w:top w:val="single" w:sz="8" w:color="000000"/>
+            </w:tcBorders>
+            <w:tcBorders>
+              <w:bottom w:val="single" w:sz="8" w:color="000000"/>
+            </w:tcBorders>
           </w:tcPr>
           <w:p>
             <w:pPr>
@@ -2253,7 +2349,7 @@
             <w:r>
               <w:rPr>
                 <w:b/>
-                <w:color w:val="FFFFFF"/>
+                <w:color w:val="000000"/>
                 <w:sz w:val="19"/>
               </w:rPr>
               <w:t>Part</w:t>
@@ -2263,7 +2359,13 @@
         <w:tc>
           <w:tcPr>
             <w:tcW w:type="dxa" w:w="1872"/>
-            <w:shd w:val="clear" w:fill="1E2761"/>
+            <w:shd w:val="clear" w:fill="D9D9D9"/>
+            <w:tcBorders>
+              <w:top w:val="single" w:sz="8" w:color="000000"/>
+            </w:tcBorders>
+            <w:tcBorders>
+              <w:bottom w:val="single" w:sz="8" w:color="000000"/>
+            </w:tcBorders>
           </w:tcPr>
           <w:p>
             <w:pPr>
@@ -2273,7 +2375,7 @@
             <w:r>
               <w:rPr>
                 <w:b/>
-                <w:color w:val="FFFFFF"/>
+                <w:color w:val="000000"/>
                 <w:sz w:val="19"/>
               </w:rPr>
               <w:t>INT8 penalty</w:t>
@@ -2283,7 +2385,13 @@
         <w:tc>
           <w:tcPr>
             <w:tcW w:type="dxa" w:w="1872"/>
-            <w:shd w:val="clear" w:fill="1E2761"/>
+            <w:shd w:val="clear" w:fill="D9D9D9"/>
+            <w:tcBorders>
+              <w:top w:val="single" w:sz="8" w:color="000000"/>
+            </w:tcBorders>
+            <w:tcBorders>
+              <w:bottom w:val="single" w:sz="8" w:color="000000"/>
+            </w:tcBorders>
           </w:tcPr>
           <w:p>
             <w:pPr>
@@ -2293,7 +2401,7 @@
             <w:r>
               <w:rPr>
                 <w:b/>
-                <w:color w:val="FFFFFF"/>
+                <w:color w:val="000000"/>
                 <w:sz w:val="19"/>
               </w:rPr>
               <w:t>cost/MB</w:t>
@@ -2303,7 +2411,13 @@
         <w:tc>
           <w:tcPr>
             <w:tcW w:type="dxa" w:w="1872"/>
-            <w:shd w:val="clear" w:fill="1E2761"/>
+            <w:shd w:val="clear" w:fill="D9D9D9"/>
+            <w:tcBorders>
+              <w:top w:val="single" w:sz="8" w:color="000000"/>
+            </w:tcBorders>
+            <w:tcBorders>
+              <w:bottom w:val="single" w:sz="8" w:color="000000"/>
+            </w:tcBorders>
           </w:tcPr>
           <w:p>
             <w:pPr>
@@ -2313,7 +2427,7 @@
             <w:r>
               <w:rPr>
                 <w:b/>
-                <w:color w:val="FFFFFF"/>
+                <w:color w:val="000000"/>
                 <w:sz w:val="19"/>
               </w:rPr>
               <w:t>int4g32 penalty</w:t>
@@ -2323,7 +2437,13 @@
         <w:tc>
           <w:tcPr>
             <w:tcW w:type="dxa" w:w="1872"/>
-            <w:shd w:val="clear" w:fill="1E2761"/>
+            <w:shd w:val="clear" w:fill="D9D9D9"/>
+            <w:tcBorders>
+              <w:top w:val="single" w:sz="8" w:color="000000"/>
+            </w:tcBorders>
+            <w:tcBorders>
+              <w:bottom w:val="single" w:sz="8" w:color="000000"/>
+            </w:tcBorders>
           </w:tcPr>
           <w:p>
             <w:pPr>
@@ -2333,7 +2453,7 @@
             <w:r>
               <w:rPr>
                 <w:b/>
-                <w:color w:val="FFFFFF"/>
+                <w:color w:val="000000"/>
                 <w:sz w:val="19"/>
               </w:rPr>
               <w:t>cost/MB</w:t>
@@ -2348,7 +2468,6 @@
         <w:tc>
           <w:tcPr>
             <w:tcW w:type="dxa" w:w="1872"/>
-            <w:shd w:val="clear" w:fill="EFF3F9"/>
           </w:tcPr>
           <w:p>
             <w:pPr>
@@ -2366,7 +2485,6 @@
         <w:tc>
           <w:tcPr>
             <w:tcW w:type="dxa" w:w="1872"/>
-            <w:shd w:val="clear" w:fill="EFF3F9"/>
           </w:tcPr>
           <w:p>
             <w:pPr>
@@ -2384,7 +2502,6 @@
         <w:tc>
           <w:tcPr>
             <w:tcW w:type="dxa" w:w="1872"/>
-            <w:shd w:val="clear" w:fill="EFF3F9"/>
           </w:tcPr>
           <w:p>
             <w:pPr>
@@ -2402,7 +2519,6 @@
         <w:tc>
           <w:tcPr>
             <w:tcW w:type="dxa" w:w="1872"/>
-            <w:shd w:val="clear" w:fill="EFF3F9"/>
           </w:tcPr>
           <w:p>
             <w:pPr>
@@ -2420,7 +2536,6 @@
         <w:tc>
           <w:tcPr>
             <w:tcW w:type="dxa" w:w="1872"/>
-            <w:shd w:val="clear" w:fill="EFF3F9"/>
           </w:tcPr>
           <w:p>
             <w:pPr>
@@ -2533,7 +2648,6 @@
         <w:tc>
           <w:tcPr>
             <w:tcW w:type="dxa" w:w="1872"/>
-            <w:shd w:val="clear" w:fill="EFF3F9"/>
           </w:tcPr>
           <w:p>
             <w:pPr>
@@ -2551,7 +2665,6 @@
         <w:tc>
           <w:tcPr>
             <w:tcW w:type="dxa" w:w="1872"/>
-            <w:shd w:val="clear" w:fill="EFF3F9"/>
           </w:tcPr>
           <w:p>
             <w:pPr>
@@ -2569,7 +2682,6 @@
         <w:tc>
           <w:tcPr>
             <w:tcW w:type="dxa" w:w="1872"/>
-            <w:shd w:val="clear" w:fill="EFF3F9"/>
           </w:tcPr>
           <w:p>
             <w:pPr>
@@ -2587,7 +2699,6 @@
         <w:tc>
           <w:tcPr>
             <w:tcW w:type="dxa" w:w="1872"/>
-            <w:shd w:val="clear" w:fill="EFF3F9"/>
           </w:tcPr>
           <w:p>
             <w:pPr>
@@ -2605,7 +2716,6 @@
         <w:tc>
           <w:tcPr>
             <w:tcW w:type="dxa" w:w="1872"/>
-            <w:shd w:val="clear" w:fill="EFF3F9"/>
           </w:tcPr>
           <w:p>
             <w:pPr>
@@ -2718,7 +2828,6 @@
         <w:tc>
           <w:tcPr>
             <w:tcW w:type="dxa" w:w="1872"/>
-            <w:shd w:val="clear" w:fill="EFF3F9"/>
           </w:tcPr>
           <w:p>
             <w:pPr>
@@ -2736,7 +2845,6 @@
         <w:tc>
           <w:tcPr>
             <w:tcW w:type="dxa" w:w="1872"/>
-            <w:shd w:val="clear" w:fill="EFF3F9"/>
           </w:tcPr>
           <w:p>
             <w:pPr>
@@ -2754,7 +2862,6 @@
         <w:tc>
           <w:tcPr>
             <w:tcW w:type="dxa" w:w="1872"/>
-            <w:shd w:val="clear" w:fill="EFF3F9"/>
           </w:tcPr>
           <w:p>
             <w:pPr>
@@ -2766,98 +2873,6 @@
                 <w:sz w:val="19"/>
               </w:rPr>
               <w:t>184</w:t>
-            </w:r>
-          </w:p>
-        </w:tc>
-        <w:tc>
-          <w:tcPr>
-            <w:tcW w:type="dxa" w:w="1872"/>
-            <w:shd w:val="clear" w:fill="EFF3F9"/>
-          </w:tcPr>
-          <w:p>
-            <w:pPr>
-              <w:jc w:val="right"/>
-            </w:pPr>
-            <w:r/>
-            <w:r>
-              <w:rPr>
-                <w:sz w:val="19"/>
-              </w:rPr>
-              <w:t>not viable</w:t>
-            </w:r>
-          </w:p>
-        </w:tc>
-        <w:tc>
-          <w:tcPr>
-            <w:tcW w:type="dxa" w:w="1872"/>
-            <w:shd w:val="clear" w:fill="EFF3F9"/>
-          </w:tcPr>
-          <w:p>
-            <w:pPr>
-              <w:jc w:val="right"/>
-            </w:pPr>
-            <w:r/>
-            <w:r>
-              <w:rPr>
-                <w:sz w:val="19"/>
-              </w:rPr>
-              <w:t>-</w:t>
-            </w:r>
-          </w:p>
-        </w:tc>
-      </w:tr>
-      <w:tr>
-        <w:trPr>
-          <w:cantSplit/>
-        </w:trPr>
-        <w:tc>
-          <w:tcPr>
-            <w:tcW w:type="dxa" w:w="1872"/>
-          </w:tcPr>
-          <w:p>
-            <w:pPr>
-              <w:jc w:val="left"/>
-            </w:pPr>
-            <w:r/>
-            <w:r>
-              <w:rPr>
-                <w:sz w:val="19"/>
-              </w:rPr>
-              <w:t>D5</w:t>
-            </w:r>
-          </w:p>
-        </w:tc>
-        <w:tc>
-          <w:tcPr>
-            <w:tcW w:type="dxa" w:w="1872"/>
-          </w:tcPr>
-          <w:p>
-            <w:pPr>
-              <w:jc w:val="right"/>
-            </w:pPr>
-            <w:r/>
-            <w:r>
-              <w:rPr>
-                <w:sz w:val="19"/>
-              </w:rPr>
-              <w:t>8.057%</w:t>
-            </w:r>
-          </w:p>
-        </w:tc>
-        <w:tc>
-          <w:tcPr>
-            <w:tcW w:type="dxa" w:w="1872"/>
-          </w:tcPr>
-          <w:p>
-            <w:pPr>
-              <w:jc w:val="right"/>
-            </w:pPr>
-            <w:r/>
-            <w:r>
-              <w:rPr>
-                <w:sz w:val="19"/>
-              </w:rPr>
-              <w:t>1712</w:t>
             </w:r>
           </w:p>
         </w:tc>
@@ -2896,6 +2911,111 @@
           </w:p>
         </w:tc>
       </w:tr>
+      <w:tr>
+        <w:trPr>
+          <w:cantSplit/>
+        </w:trPr>
+        <w:tc>
+          <w:tcPr>
+            <w:tcW w:type="dxa" w:w="1872"/>
+            <w:tcBorders>
+              <w:bottom w:val="single" w:sz="8" w:color="000000"/>
+            </w:tcBorders>
+          </w:tcPr>
+          <w:p>
+            <w:pPr>
+              <w:jc w:val="left"/>
+            </w:pPr>
+            <w:r/>
+            <w:r>
+              <w:rPr>
+                <w:sz w:val="19"/>
+              </w:rPr>
+              <w:t>D5</w:t>
+            </w:r>
+          </w:p>
+        </w:tc>
+        <w:tc>
+          <w:tcPr>
+            <w:tcW w:type="dxa" w:w="1872"/>
+            <w:tcBorders>
+              <w:bottom w:val="single" w:sz="8" w:color="000000"/>
+            </w:tcBorders>
+          </w:tcPr>
+          <w:p>
+            <w:pPr>
+              <w:jc w:val="right"/>
+            </w:pPr>
+            <w:r/>
+            <w:r>
+              <w:rPr>
+                <w:sz w:val="19"/>
+              </w:rPr>
+              <w:t>8.057%</w:t>
+            </w:r>
+          </w:p>
+        </w:tc>
+        <w:tc>
+          <w:tcPr>
+            <w:tcW w:type="dxa" w:w="1872"/>
+            <w:tcBorders>
+              <w:bottom w:val="single" w:sz="8" w:color="000000"/>
+            </w:tcBorders>
+          </w:tcPr>
+          <w:p>
+            <w:pPr>
+              <w:jc w:val="right"/>
+            </w:pPr>
+            <w:r/>
+            <w:r>
+              <w:rPr>
+                <w:sz w:val="19"/>
+              </w:rPr>
+              <w:t>1712</w:t>
+            </w:r>
+          </w:p>
+        </w:tc>
+        <w:tc>
+          <w:tcPr>
+            <w:tcW w:type="dxa" w:w="1872"/>
+            <w:tcBorders>
+              <w:bottom w:val="single" w:sz="8" w:color="000000"/>
+            </w:tcBorders>
+          </w:tcPr>
+          <w:p>
+            <w:pPr>
+              <w:jc w:val="right"/>
+            </w:pPr>
+            <w:r/>
+            <w:r>
+              <w:rPr>
+                <w:sz w:val="19"/>
+              </w:rPr>
+              <w:t>not viable</w:t>
+            </w:r>
+          </w:p>
+        </w:tc>
+        <w:tc>
+          <w:tcPr>
+            <w:tcW w:type="dxa" w:w="1872"/>
+            <w:tcBorders>
+              <w:bottom w:val="single" w:sz="8" w:color="000000"/>
+            </w:tcBorders>
+          </w:tcPr>
+          <w:p>
+            <w:pPr>
+              <w:jc w:val="right"/>
+            </w:pPr>
+            <w:r/>
+            <w:r>
+              <w:rPr>
+                <w:sz w:val="19"/>
+              </w:rPr>
+              <w:t>-</w:t>
+            </w:r>
+          </w:p>
+        </w:tc>
+      </w:tr>
     </w:tbl>
     <w:p>
       <w:pPr>
@@ -2904,7 +3024,7 @@
       <w:r>
         <w:rPr>
           <w:i/>
-          <w:color w:val="6B7A8C"/>
+          <w:color w:val="000000"/>
           <w:sz w:val="17"/>
         </w:rPr>
         <w:t>Table 4. Cost per megabyte saved. Group-32 scaling cut INT4 weight error by 40 percent and damage by 5 to 22 times. Source: results/qat/WHY_THESE_COMPONENTS.md.</w:t>
@@ -3501,7 +3621,7 @@
     </w:pPr>
     <w:rPr>
       <w:rFonts w:ascii="Calibri" w:hAnsi="Calibri"/>
-      <w:color w:val="36454F"/>
+      <w:color w:val="000000"/>
       <w:sz w:val="21"/>
     </w:rPr>
   </w:style>
@@ -3567,7 +3687,7 @@
       <w:rFonts w:asciiTheme="majorHAnsi" w:eastAsiaTheme="majorEastAsia" w:hAnsiTheme="majorHAnsi" w:cstheme="majorBidi" w:ascii="Cambria" w:hAnsi="Cambria"/>
       <w:b/>
       <w:bCs/>
-      <w:color w:val="1E2761"/>
+      <w:color w:val="000000"/>
       <w:sz w:val="30"/>
       <w:szCs w:val="28"/>
     </w:rPr>
@@ -3591,7 +3711,7 @@
       <w:rFonts w:asciiTheme="majorHAnsi" w:eastAsiaTheme="majorEastAsia" w:hAnsiTheme="majorHAnsi" w:cstheme="majorBidi" w:ascii="Cambria" w:hAnsi="Cambria"/>
       <w:b/>
       <w:bCs/>
-      <w:color w:val="1E2761"/>
+      <w:color w:val="000000"/>
       <w:sz w:val="24"/>
       <w:szCs w:val="26"/>
     </w:rPr>

</xml_diff>